<commit_message>
snapshot: frontend dashboard charts, composite fix UI, docs + backend pointer
Frontend/docs work from the 2026-06-01 session:
- New dashboard charts: failures-by-job, resolution-mix
- Errors-over-time chart, failures list/detail drawer, recommendations updates
- Monitored-jobs config: composite step editor, InputPathPattern/FilePathColumn fields
- config/failures service updates; recommendation/failure/monitored-job model changes
- Bump embedded MaiaAIEngine.services pointer to backend commit (composite fixes,
  placeholder resolver, atomic rec claim, executor timeouts, FilenamePattern)
- CLAUDE.md architecture notes; docs/ToDo.docx; batchScripts/RerunFile.bat

Co-Authored-By: Claude Opus 4.8 (1M context) <noreply@anthropic.com>
</commit_message>
<xml_diff>
--- a/docs/ToDo.docx
+++ b/docs/ToDo.docx
@@ -183,28 +183,12 @@
         </w:rPr>
         <w:t xml:space="preserve"> להגדיר לתהליך הסריקה לחפש שגיאות נוספות בלוגים ולהציע המלצות </w:t>
       </w:r>
-      <w:proofErr w:type="spellStart"/>
-      <w:r>
-        <w:rPr>
-          <w:lang w:val="en-US"/>
-        </w:rPr>
-        <w:t>SCANRule</w:t>
-      </w:r>
-      <w:proofErr w:type="spellEnd"/>
-      <w:r>
-        <w:rPr>
-          <w:lang w:val="en-US"/>
-        </w:rPr>
-        <w:t xml:space="preserve"> + </w:t>
-      </w:r>
-      <w:proofErr w:type="spellStart"/>
-      <w:r>
-        <w:rPr>
-          <w:lang w:val="en-US"/>
-        </w:rPr>
-        <w:t>RecommandationRulle</w:t>
-      </w:r>
-      <w:proofErr w:type="spellEnd"/>
+      <w:r>
+        <w:rPr>
+          <w:lang w:val="en-US"/>
+        </w:rPr>
+        <w:t>SCANRule + RecommandationRulle</w:t>
+      </w:r>
       <w:r>
         <w:rPr>
           <w:rFonts w:hint="cs"/>
@@ -282,7 +266,63 @@
           <w:rtl/>
           <w:lang w:val="en-US"/>
         </w:rPr>
-        <w:t>לאפשר בניה מהירה יותר ואוטומטית של מוניטור כולל הגדרות ה סריקה המלצות והתיקון.</w:t>
+        <w:t xml:space="preserve">הוספת הגדרת </w:t>
+      </w:r>
+      <w:r>
+        <w:rPr>
+          <w:lang w:val="en-US"/>
+        </w:rPr>
+        <w:t>RULE</w:t>
+      </w:r>
+      <w:r>
+        <w:rPr>
+          <w:rFonts w:hint="cs"/>
+          <w:rtl/>
+          <w:lang w:val="en-US"/>
+        </w:rPr>
+        <w:t xml:space="preserve"> ברמת ה </w:t>
+      </w:r>
+      <w:r>
+        <w:rPr>
+          <w:lang w:val="en-US"/>
+        </w:rPr>
+        <w:t xml:space="preserve">Fixer   </w:t>
+      </w:r>
+      <w:r>
+        <w:rPr>
+          <w:rFonts w:hint="cs"/>
+          <w:rtl/>
+          <w:lang w:val="en-US"/>
+        </w:rPr>
+        <w:t xml:space="preserve"> חיבור ל </w:t>
+      </w:r>
+      <w:r>
+        <w:rPr>
+          <w:lang w:val="en-US"/>
+        </w:rPr>
+        <w:t xml:space="preserve">ErrorType+ScanRule </w:t>
+      </w:r>
+      <w:r>
+        <w:rPr>
+          <w:rFonts w:hint="cs"/>
+          <w:rtl/>
+          <w:lang w:val="en-US"/>
+        </w:rPr>
+        <w:t xml:space="preserve">  כרגע לא יודע איזה מה</w:t>
+      </w:r>
+      <w:r>
+        <w:rPr>
+          <w:lang w:val="en-US"/>
+        </w:rPr>
+        <w:t>Rules</w:t>
+      </w:r>
+      <w:r>
+        <w:rPr>
+          <w:rFonts w:hint="cs"/>
+          <w:rtl/>
+          <w:lang w:val="en-US"/>
+        </w:rPr>
+        <w:t xml:space="preserve">  הוא מתקן כאשר יש שניים מאותו סוג שגיאה.</w:t>
       </w:r>
     </w:p>
     <w:p>
@@ -299,25 +339,23 @@
       </w:pPr>
       <w:r>
         <w:rPr>
-          <w:rFonts w:hint="cs"/>
-          <w:rtl/>
-          <w:lang w:val="en-US"/>
-        </w:rPr>
-        <w:t xml:space="preserve">אפשרות לטעון קובץ לוג שכולל שגיאות ולתת ל מנוע להמליץ ו\או לבנות </w:t>
-      </w:r>
-      <w:r>
-        <w:rPr>
-          <w:lang w:val="en-US"/>
-        </w:rPr>
-        <w:t>rules</w:t>
-      </w:r>
-      <w:r>
-        <w:rPr>
-          <w:rFonts w:hint="cs"/>
-          <w:rtl/>
-          <w:lang w:val="en-US"/>
-        </w:rPr>
-        <w:t xml:space="preserve">  בהתאם לשגיאות מוכרות שמצא .</w:t>
+          <w:lang w:val="en-US"/>
+        </w:rPr>
+        <w:t xml:space="preserve"> </w:t>
+      </w:r>
+      <w:r>
+        <w:rPr>
+          <w:rFonts w:hint="cs"/>
+          <w:rtl/>
+          <w:lang w:val="en-US"/>
+        </w:rPr>
+        <w:t>לאפשר בניה מהירה יותר ואוטומטית של מוניטור כולל הגדרות ה סריקה המלצות והתיקון.</w:t>
+      </w:r>
+      <w:r>
+        <w:rPr>
+          <w:lang w:val="en-US"/>
+        </w:rPr>
+        <w:t xml:space="preserve"> </w:t>
       </w:r>
     </w:p>
     <w:p>
@@ -338,21 +376,21 @@
           <w:rtl/>
           <w:lang w:val="en-US"/>
         </w:rPr>
-        <w:t xml:space="preserve">התראות קריטיות ועדכון ב </w:t>
-      </w:r>
-      <w:r>
-        <w:rPr>
-          <w:lang w:val="en-US"/>
-        </w:rPr>
-        <w:t xml:space="preserve">push </w:t>
-      </w:r>
-      <w:r>
-        <w:rPr>
-          <w:rFonts w:hint="cs"/>
-          <w:rtl/>
-          <w:lang w:val="en-US"/>
-        </w:rPr>
-        <w:t xml:space="preserve"> למשתמש , (זימונית)</w:t>
+        <w:t xml:space="preserve">אפשרות לטעון קובץ לוג שכולל שגיאות ולתת ל מנוע להמליץ ו\או לבנות </w:t>
+      </w:r>
+      <w:r>
+        <w:rPr>
+          <w:lang w:val="en-US"/>
+        </w:rPr>
+        <w:t>rules</w:t>
+      </w:r>
+      <w:r>
+        <w:rPr>
+          <w:rFonts w:hint="cs"/>
+          <w:rtl/>
+          <w:lang w:val="en-US"/>
+        </w:rPr>
+        <w:t xml:space="preserve">  בהתאם לשגיאות מוכרות שמצא .</w:t>
       </w:r>
     </w:p>
     <w:p>
@@ -373,6 +411,41 @@
           <w:rtl/>
           <w:lang w:val="en-US"/>
         </w:rPr>
+        <w:t xml:space="preserve">התראות קריטיות ועדכון ב </w:t>
+      </w:r>
+      <w:r>
+        <w:rPr>
+          <w:lang w:val="en-US"/>
+        </w:rPr>
+        <w:t xml:space="preserve">push </w:t>
+      </w:r>
+      <w:r>
+        <w:rPr>
+          <w:rFonts w:hint="cs"/>
+          <w:rtl/>
+          <w:lang w:val="en-US"/>
+        </w:rPr>
+        <w:t xml:space="preserve"> למשתמש , (זימונית)</w:t>
+      </w:r>
+    </w:p>
+    <w:p>
+      <w:pPr>
+        <w:pStyle w:val="ListParagraph"/>
+        <w:numPr>
+          <w:ilvl w:val="0"/>
+          <w:numId w:val="1"/>
+        </w:numPr>
+        <w:bidi/>
+        <w:rPr>
+          <w:lang w:val="en-US"/>
+        </w:rPr>
+      </w:pPr>
+      <w:r>
+        <w:rPr>
+          <w:rFonts w:hint="cs"/>
+          <w:rtl/>
+          <w:lang w:val="en-US"/>
+        </w:rPr>
         <w:t xml:space="preserve">עתידי </w:t>
       </w:r>
       <w:r>
@@ -411,6 +484,48 @@
           <w:lang w:val="en-US"/>
         </w:rPr>
         <w:t>המליץ על פי תחזית שגיאות .</w:t>
+      </w:r>
+    </w:p>
+    <w:p>
+      <w:pPr>
+        <w:pStyle w:val="ListParagraph"/>
+        <w:numPr>
+          <w:ilvl w:val="0"/>
+          <w:numId w:val="1"/>
+        </w:numPr>
+        <w:bidi/>
+        <w:rPr>
+          <w:lang w:val="en-US"/>
+        </w:rPr>
+      </w:pPr>
+      <w:r>
+        <w:rPr>
+          <w:lang w:val="en-US"/>
+        </w:rPr>
+        <w:t>LLM</w:t>
+      </w:r>
+      <w:r>
+        <w:rPr>
+          <w:rFonts w:hint="cs"/>
+          <w:rtl/>
+          <w:lang w:val="en-US"/>
+        </w:rPr>
+        <w:t xml:space="preserve"> </w:t>
+      </w:r>
+      <w:r>
+        <w:rPr>
+          <w:rtl/>
+          <w:lang w:val="en-US"/>
+        </w:rPr>
+        <w:t>–</w:t>
+      </w:r>
+      <w:r>
+        <w:rPr>
+          <w:rFonts w:hint="cs"/>
+          <w:rtl/>
+          <w:lang w:val="en-US"/>
+        </w:rPr>
+        <w:t xml:space="preserve"> בניית תרחישי סריקה ותיקון באופן אוטמטי או מודרך.</w:t>
       </w:r>
     </w:p>
     <w:sectPr>

</xml_diff>

<commit_message>
feat(auth): frontend login/session + docs for auth v1; bump backend gitlink
Angular: AuthService + credentials/error interceptors (3-case: 401->login, 403 PasswordChangeRequired->change-password, plain 403->toast), login + change-password (skippable) components, authGuard, top-bar user/logout, shell toasts; operatorId removed from services/components. Docs: CLAUDE.md auth entry + decisions, AUTH-CUTOVER-RUNBOOK.md. Bumps MaiaAIEngine.services gitlink to the auth backend commit.

Co-Authored-By: Claude Opus 4.8 (1M context) <noreply@anthropic.com>
</commit_message>
<xml_diff>
--- a/docs/ToDo.docx
+++ b/docs/ToDo.docx
@@ -426,6 +426,29 @@
           <w:lang w:val="en-US"/>
         </w:rPr>
         <w:t xml:space="preserve"> למשתמש , (זימונית)</w:t>
+      </w:r>
+    </w:p>
+    <w:p>
+      <w:pPr>
+        <w:pStyle w:val="ListParagraph"/>
+        <w:numPr>
+          <w:ilvl w:val="0"/>
+          <w:numId w:val="1"/>
+        </w:numPr>
+        <w:bidi/>
+        <w:rPr>
+          <w:rFonts w:hint="cs"/>
+          <w:rtl/>
+          <w:lang w:val="en-US"/>
+        </w:rPr>
+      </w:pPr>
+      <w:r>
+        <w:rPr>
+          <w:rFonts w:hint="cs"/>
+          <w:rtl/>
+          <w:lang w:val="en-US"/>
+        </w:rPr>
+        <w:t>יצוא \ יבוא של הגדרות.</w:t>
       </w:r>
     </w:p>
     <w:p>

</xml_diff>